<commit_message>
chore: add PHP 8.5.11 runtime and update lab A report
</commit_message>
<xml_diff>
--- a/AI2-LA-gr432-woźniak-jakub.docx
+++ b/AI2-LA-gr432-woźniak-jakub.docx
@@ -18,8 +18,8 @@
         <w:tblLook w:val="04a0" w:firstRow="1" w:noVBand="1" w:lastRow="0" w:firstColumn="1" w:lastColumn="0" w:noHBand="0"/>
       </w:tblPr>
       <w:tblGrid>
-        <w:gridCol w:w="1695"/>
-        <w:gridCol w:w="4254"/>
+        <w:gridCol w:w="1694"/>
+        <w:gridCol w:w="4255"/>
         <w:gridCol w:w="4507"/>
       </w:tblGrid>
       <w:tr>
@@ -28,7 +28,7 @@
         </w:trPr>
         <w:tc>
           <w:tcPr>
-            <w:tcW w:w="1695" w:type="dxa"/>
+            <w:tcW w:w="1694" w:type="dxa"/>
             <w:vMerge w:val="restart"/>
             <w:tcBorders>
               <w:top w:val="single" w:sz="4" w:space="0" w:color="D9D9D9"/>
@@ -43,6 +43,7 @@
             <w:pPr>
               <w:pStyle w:val="Normal"/>
               <w:widowControl/>
+              <w:suppressAutoHyphens w:val="true"/>
               <w:spacing w:lineRule="auto" w:line="240" w:before="0" w:after="0"/>
               <w:jc w:val="center"/>
               <w:rPr>
@@ -115,7 +116,7 @@
         </w:tc>
         <w:tc>
           <w:tcPr>
-            <w:tcW w:w="4254" w:type="dxa"/>
+            <w:tcW w:w="4255" w:type="dxa"/>
             <w:vMerge w:val="restart"/>
             <w:tcBorders>
               <w:top w:val="single" w:sz="4" w:space="0" w:color="D9D9D9"/>
@@ -129,6 +130,7 @@
             <w:pPr>
               <w:pStyle w:val="Normal"/>
               <w:widowControl/>
+              <w:suppressAutoHyphens w:val="true"/>
               <w:spacing w:lineRule="auto" w:line="240" w:before="0" w:after="0"/>
               <w:jc w:val="center"/>
               <w:rPr>
@@ -252,6 +254,7 @@
             <w:pPr>
               <w:pStyle w:val="Normal"/>
               <w:widowControl/>
+              <w:suppressAutoHyphens w:val="true"/>
               <w:spacing w:lineRule="auto" w:line="240" w:before="0" w:after="0"/>
               <w:jc w:val="center"/>
               <w:rPr>
@@ -323,6 +326,7 @@
             <w:pPr>
               <w:pStyle w:val="Normal"/>
               <w:widowControl/>
+              <w:suppressAutoHyphens w:val="true"/>
               <w:spacing w:lineRule="auto" w:line="240" w:before="0" w:after="0"/>
               <w:jc w:val="center"/>
               <w:rPr>
@@ -406,6 +410,7 @@
             <w:pPr>
               <w:pStyle w:val="Normal"/>
               <w:widowControl/>
+              <w:suppressAutoHyphens w:val="true"/>
               <w:spacing w:lineRule="auto" w:line="240" w:before="0" w:after="0"/>
               <w:jc w:val="end"/>
               <w:rPr>
@@ -495,7 +500,7 @@
         </w:trPr>
         <w:tc>
           <w:tcPr>
-            <w:tcW w:w="1695" w:type="dxa"/>
+            <w:tcW w:w="1694" w:type="dxa"/>
             <w:vMerge w:val="continue"/>
             <w:tcBorders>
               <w:top w:val="single" w:sz="4" w:space="0" w:color="D9D9D9"/>
@@ -510,6 +515,7 @@
             <w:pPr>
               <w:pStyle w:val="Normal"/>
               <w:widowControl/>
+              <w:suppressAutoHyphens w:val="true"/>
               <w:spacing w:lineRule="auto" w:line="240" w:before="0" w:after="0"/>
               <w:jc w:val="center"/>
               <w:rPr>
@@ -522,20 +528,18 @@
             </w:pPr>
             <w:r>
               <w:rPr>
-                <w:rFonts w:eastAsia="Calibri" w:cs="Arial"/>
                 <w:b/>
                 <w:bCs/>
-                <w:kern w:val="2"/>
                 <w:sz w:val="48"/>
                 <w:szCs w:val="48"/>
-                <w:lang w:val="pl-PL" w:eastAsia="en-US" w:bidi="ar-SA"/>
+                <w:lang w:val="pl-PL"/>
               </w:rPr>
             </w:r>
           </w:p>
         </w:tc>
         <w:tc>
           <w:tcPr>
-            <w:tcW w:w="4254" w:type="dxa"/>
+            <w:tcW w:w="4255" w:type="dxa"/>
             <w:vMerge w:val="continue"/>
             <w:tcBorders>
               <w:top w:val="single" w:sz="4" w:space="0" w:color="D9D9D9"/>
@@ -549,6 +553,7 @@
             <w:pPr>
               <w:pStyle w:val="Normal"/>
               <w:widowControl/>
+              <w:suppressAutoHyphens w:val="true"/>
               <w:spacing w:lineRule="auto" w:line="240" w:before="0" w:after="0"/>
               <w:jc w:val="center"/>
               <w:rPr>
@@ -559,11 +564,9 @@
             </w:pPr>
             <w:r>
               <w:rPr>
-                <w:rFonts w:eastAsia="Calibri" w:cs="Arial"/>
-                <w:kern w:val="2"/>
                 <w:sz w:val="28"/>
                 <w:szCs w:val="28"/>
-                <w:lang w:val="pl-PL" w:eastAsia="en-US" w:bidi="ar-SA"/>
+                <w:lang w:val="pl-PL"/>
               </w:rPr>
             </w:r>
           </w:p>
@@ -583,6 +586,7 @@
             <w:pPr>
               <w:pStyle w:val="Normal"/>
               <w:widowControl/>
+              <w:suppressAutoHyphens w:val="true"/>
               <w:spacing w:lineRule="auto" w:line="240" w:before="0" w:after="0"/>
               <w:jc w:val="start"/>
               <w:rPr>
@@ -591,11 +595,7 @@
             </w:pPr>
             <w:r>
               <w:rPr>
-                <w:rFonts w:eastAsia="Calibri" w:cs="Arial"/>
-                <w:kern w:val="2"/>
-                <w:sz w:val="22"/>
-                <w:szCs w:val="22"/>
-                <w:lang w:val="pl-PL" w:eastAsia="en-US" w:bidi="ar-SA"/>
+                <w:lang w:val="pl-PL"/>
               </w:rPr>
             </w:r>
           </w:p>
@@ -607,7 +607,7 @@
         </w:trPr>
         <w:tc>
           <w:tcPr>
-            <w:tcW w:w="1695" w:type="dxa"/>
+            <w:tcW w:w="1694" w:type="dxa"/>
             <w:tcBorders>
               <w:top w:val="single" w:sz="4" w:space="0" w:color="D9D9D9"/>
               <w:start w:val="single" w:sz="4" w:space="0" w:color="D9D9D9"/>
@@ -620,6 +620,7 @@
             <w:pPr>
               <w:pStyle w:val="Normal"/>
               <w:widowControl/>
+              <w:suppressAutoHyphens w:val="true"/>
               <w:spacing w:lineRule="auto" w:line="240" w:before="0" w:after="0"/>
               <w:jc w:val="center"/>
               <w:rPr>
@@ -692,7 +693,7 @@
         </w:tc>
         <w:tc>
           <w:tcPr>
-            <w:tcW w:w="4254" w:type="dxa"/>
+            <w:tcW w:w="4255" w:type="dxa"/>
             <w:vMerge w:val="continue"/>
             <w:tcBorders>
               <w:top w:val="single" w:sz="4" w:space="0" w:color="D9D9D9"/>
@@ -705,6 +706,7 @@
             <w:pPr>
               <w:pStyle w:val="Normal"/>
               <w:widowControl/>
+              <w:suppressAutoHyphens w:val="true"/>
               <w:spacing w:lineRule="auto" w:line="240" w:before="0" w:after="0"/>
               <w:jc w:val="start"/>
               <w:rPr>
@@ -713,11 +715,7 @@
             </w:pPr>
             <w:r>
               <w:rPr>
-                <w:rFonts w:eastAsia="Calibri" w:cs="Arial"/>
-                <w:kern w:val="2"/>
-                <w:sz w:val="22"/>
-                <w:szCs w:val="22"/>
-                <w:lang w:val="pl-PL" w:eastAsia="en-US" w:bidi="ar-SA"/>
+                <w:lang w:val="pl-PL"/>
               </w:rPr>
             </w:r>
           </w:p>
@@ -737,6 +735,7 @@
             <w:pPr>
               <w:pStyle w:val="Normal"/>
               <w:widowControl/>
+              <w:suppressAutoHyphens w:val="true"/>
               <w:spacing w:lineRule="auto" w:line="240" w:before="0" w:after="0"/>
               <w:jc w:val="start"/>
               <w:rPr>
@@ -745,11 +744,7 @@
             </w:pPr>
             <w:r>
               <w:rPr>
-                <w:rFonts w:eastAsia="Calibri" w:cs="Arial"/>
-                <w:kern w:val="2"/>
-                <w:sz w:val="22"/>
-                <w:szCs w:val="22"/>
-                <w:lang w:val="pl-PL" w:eastAsia="en-US" w:bidi="ar-SA"/>
+                <w:lang w:val="pl-PL"/>
               </w:rPr>
             </w:r>
           </w:p>
@@ -814,6 +809,7 @@
           <w:r>
             <w:rPr>
               <w:rStyle w:val="czeindeksu"/>
+              <w:vanish w:val="false"/>
               <w:webHidden/>
               <w:lang w:val="pl-PL"/>
             </w:rPr>
@@ -822,6 +818,7 @@
           <w:r>
             <w:rPr>
               <w:rStyle w:val="czeindeksu"/>
+              <w:vanish w:val="false"/>
               <w:webHidden/>
               <w:lang w:val="pl-PL"/>
             </w:rPr>
@@ -831,6 +828,7 @@
             <w:r>
               <w:rPr>
                 <w:rStyle w:val="czeindeksu"/>
+                <w:vanish w:val="false"/>
                 <w:webHidden/>
                 <w:lang w:val="pl-PL"/>
               </w:rPr>
@@ -888,6 +886,7 @@
             <w:r>
               <w:rPr>
                 <w:rStyle w:val="czeindeksu"/>
+                <w:vanish w:val="false"/>
                 <w:webHidden/>
                 <w:lang w:val="pl-PL"/>
               </w:rPr>
@@ -945,6 +944,7 @@
             <w:r>
               <w:rPr>
                 <w:rStyle w:val="czeindeksu"/>
+                <w:vanish w:val="false"/>
                 <w:webHidden/>
                 <w:lang w:val="pl-PL"/>
               </w:rPr>
@@ -1002,6 +1002,7 @@
             <w:r>
               <w:rPr>
                 <w:rStyle w:val="czeindeksu"/>
+                <w:vanish w:val="false"/>
                 <w:webHidden/>
                 <w:lang w:val="pl-PL"/>
               </w:rPr>
@@ -1059,6 +1060,7 @@
             <w:r>
               <w:rPr>
                 <w:rStyle w:val="czeindeksu"/>
+                <w:vanish w:val="false"/>
                 <w:webHidden/>
                 <w:lang w:val="pl-PL"/>
               </w:rPr>
@@ -1116,6 +1118,7 @@
             <w:r>
               <w:rPr>
                 <w:rStyle w:val="czeindeksu"/>
+                <w:vanish w:val="false"/>
                 <w:webHidden/>
                 <w:lang w:val="pl-PL"/>
               </w:rPr>
@@ -1172,13 +1175,6 @@
           <w:hyperlink w:anchor="_Toc240323088">
             <w:r>
               <w:rPr>
-                <w:rStyle w:val="czeindeksu"/>
-                <w:webHidden/>
-              </w:rPr>
-              <w:t>Utworzenie i wykonanie programu</w:t>
-            </w:r>
-            <w:r>
-              <w:rPr>
                 <w:webHidden/>
               </w:rPr>
               <w:fldChar w:fldCharType="begin"/>
@@ -1199,7 +1195,9 @@
               <w:rPr>
                 <w:rStyle w:val="czeindeksu"/>
                 <w:vanish w:val="false"/>
-              </w:rPr>
+                <w:webHidden/>
+              </w:rPr>
+              <w:t>Utworzenie i wykonanie programu</w:t>
               <w:tab/>
               <w:t>5</w:t>
             </w:r>
@@ -1229,6 +1227,7 @@
             <w:r>
               <w:rPr>
                 <w:rStyle w:val="czeindeksu"/>
+                <w:vanish w:val="false"/>
                 <w:webHidden/>
                 <w:lang w:val="pl-PL"/>
               </w:rPr>
@@ -1285,13 +1284,6 @@
           <w:hyperlink w:anchor="_Toc240323090">
             <w:r>
               <w:rPr>
-                <w:rStyle w:val="czeindeksu"/>
-                <w:webHidden/>
-              </w:rPr>
-              <w:t>Wykorzystanie różnych poziomów logowania Monolog</w:t>
-            </w:r>
-            <w:r>
-              <w:rPr>
                 <w:webHidden/>
               </w:rPr>
               <w:fldChar w:fldCharType="begin"/>
@@ -1312,7 +1304,9 @@
               <w:rPr>
                 <w:rStyle w:val="czeindeksu"/>
                 <w:vanish w:val="false"/>
-              </w:rPr>
+                <w:webHidden/>
+              </w:rPr>
+              <w:t>Wykorzystanie różnych poziomów logowania Monolog</w:t>
               <w:tab/>
               <w:t>7</w:t>
             </w:r>
@@ -1341,13 +1335,6 @@
           <w:hyperlink w:anchor="_Toc240323091">
             <w:r>
               <w:rPr>
-                <w:rStyle w:val="czeindeksu"/>
-                <w:webHidden/>
-              </w:rPr>
-              <w:t>Dependency Injection</w:t>
-            </w:r>
-            <w:r>
-              <w:rPr>
                 <w:webHidden/>
               </w:rPr>
               <w:fldChar w:fldCharType="begin"/>
@@ -1368,7 +1355,9 @@
               <w:rPr>
                 <w:rStyle w:val="czeindeksu"/>
                 <w:vanish w:val="false"/>
-              </w:rPr>
+                <w:webHidden/>
+              </w:rPr>
+              <w:t>Dependency Injection</w:t>
               <w:tab/>
               <w:t>8</w:t>
             </w:r>
@@ -1397,13 +1386,6 @@
           <w:hyperlink w:anchor="_Toc240323092">
             <w:r>
               <w:rPr>
-                <w:rStyle w:val="czeindeksu"/>
-                <w:webHidden/>
-              </w:rPr>
-              <w:t>Podsumowanie</w:t>
-            </w:r>
-            <w:r>
-              <w:rPr>
                 <w:webHidden/>
               </w:rPr>
               <w:fldChar w:fldCharType="begin"/>
@@ -1424,7 +1406,9 @@
               <w:rPr>
                 <w:rStyle w:val="czeindeksu"/>
                 <w:vanish w:val="false"/>
-              </w:rPr>
+                <w:webHidden/>
+              </w:rPr>
+              <w:t>Podsumowanie</w:t>
               <w:tab/>
               <w:t>9</w:t>
             </w:r>
@@ -2626,10 +2610,18 @@
       <w:r>
         <w:rPr/>
         <w:drawing>
-          <wp:inline distT="0" distB="0" distL="0" distR="0">
-            <wp:extent cx="899795" cy="899795"/>
+          <wp:anchor distT="0" distB="0" distL="0" distR="0" simplePos="0" relativeHeight="13" behindDoc="0" locked="0" layoutInCell="0" allowOverlap="1">
+            <wp:simplePos x="0" y="0"/>
+            <wp:positionH relativeFrom="column">
+              <wp:align>center</wp:align>
+            </wp:positionH>
+            <wp:positionV relativeFrom="paragraph">
+              <wp:posOffset>635</wp:posOffset>
+            </wp:positionV>
+            <wp:extent cx="6645910" cy="2938780"/>
             <wp:effectExtent l="0" t="0" r="0" b="0"/>
-            <wp:docPr id="3" name="Obraz 1383814894"/>
+            <wp:wrapSquare wrapText="largest"/>
+            <wp:docPr id="3" name="Obraz2"/>
             <wp:cNvGraphicFramePr>
               <a:graphicFrameLocks xmlns:a="http://schemas.openxmlformats.org/drawingml/2006/main" noChangeAspect="1"/>
             </wp:cNvGraphicFramePr>
@@ -2637,7 +2629,7 @@
               <a:graphicData uri="http://schemas.openxmlformats.org/drawingml/2006/picture">
                 <pic:pic xmlns:pic="http://schemas.openxmlformats.org/drawingml/2006/picture">
                   <pic:nvPicPr>
-                    <pic:cNvPr id="3" name="Obraz 1383814894"/>
+                    <pic:cNvPr id="3" name="Obraz2"/>
                     <pic:cNvPicPr>
                       <a:picLocks noChangeAspect="1" noChangeArrowheads="1"/>
                     </pic:cNvPicPr>
@@ -2651,7 +2643,7 @@
                   <pic:spPr bwMode="auto">
                     <a:xfrm>
                       <a:off x="0" y="0"/>
-                      <a:ext cx="899795" cy="899795"/>
+                      <a:ext cx="6645910" cy="2938780"/>
                     </a:xfrm>
                     <a:prstGeom prst="rect">
                       <a:avLst/>
@@ -2661,7 +2653,7 @@
                 </pic:pic>
               </a:graphicData>
             </a:graphic>
-          </wp:inline>
+          </wp:anchor>
         </w:drawing>
       </w:r>
     </w:p>
@@ -2681,8 +2673,8 @@
         <w:tblLook w:val="04a0" w:firstRow="1" w:noVBand="1" w:lastRow="0" w:firstColumn="1" w:lastColumn="0" w:noHBand="0"/>
       </w:tblPr>
       <w:tblGrid>
-        <w:gridCol w:w="8195"/>
-        <w:gridCol w:w="1135"/>
+        <w:gridCol w:w="8194"/>
+        <w:gridCol w:w="1136"/>
         <w:gridCol w:w="1136"/>
       </w:tblGrid>
       <w:tr>
@@ -2691,7 +2683,7 @@
         </w:trPr>
         <w:tc>
           <w:tcPr>
-            <w:tcW w:w="8195" w:type="dxa"/>
+            <w:tcW w:w="8194" w:type="dxa"/>
             <w:tcBorders/>
             <w:vAlign w:val="center"/>
           </w:tcPr>
@@ -2699,6 +2691,7 @@
             <w:pPr>
               <w:pStyle w:val="PunktyTabela"/>
               <w:widowControl/>
+              <w:suppressAutoHyphens w:val="true"/>
               <w:spacing w:before="0" w:after="0"/>
               <w:jc w:val="start"/>
               <w:rPr>
@@ -2718,38 +2711,6 @@
                 <w:lang w:eastAsia="en-US" w:bidi="ar-SA"/>
               </w:rPr>
               <w:t>Punkty:</w:t>
-            </w:r>
-          </w:p>
-        </w:tc>
-        <w:tc>
-          <w:tcPr>
-            <w:tcW w:w="1135" w:type="dxa"/>
-            <w:tcBorders/>
-            <w:vAlign w:val="center"/>
-          </w:tcPr>
-          <w:p>
-            <w:pPr>
-              <w:pStyle w:val="PunktyTabela"/>
-              <w:widowControl/>
-              <w:spacing w:before="0" w:after="0"/>
-              <w:jc w:val="center"/>
-              <w:rPr>
-                <w:rFonts w:ascii="Calibri" w:hAnsi="Calibri" w:eastAsia="Calibri" w:cs="Arial"/>
-                <w:kern w:val="2"/>
-                <w:sz w:val="22"/>
-                <w:szCs w:val="22"/>
-                <w:lang w:eastAsia="en-US" w:bidi="ar-SA"/>
-              </w:rPr>
-            </w:pPr>
-            <w:r>
-              <w:rPr>
-                <w:rFonts w:eastAsia="Calibri" w:cs="Arial"/>
-                <w:kern w:val="2"/>
-                <w:sz w:val="22"/>
-                <w:szCs w:val="22"/>
-                <w:lang w:eastAsia="en-US" w:bidi="ar-SA"/>
-              </w:rPr>
-              <w:t>0</w:t>
             </w:r>
           </w:p>
         </w:tc>
@@ -2763,6 +2724,40 @@
             <w:pPr>
               <w:pStyle w:val="PunktyTabela"/>
               <w:widowControl/>
+              <w:suppressAutoHyphens w:val="true"/>
+              <w:spacing w:before="0" w:after="0"/>
+              <w:jc w:val="center"/>
+              <w:rPr>
+                <w:rFonts w:ascii="Calibri" w:hAnsi="Calibri" w:eastAsia="Calibri" w:cs="Arial"/>
+                <w:kern w:val="2"/>
+                <w:sz w:val="22"/>
+                <w:szCs w:val="22"/>
+                <w:lang w:eastAsia="en-US" w:bidi="ar-SA"/>
+              </w:rPr>
+            </w:pPr>
+            <w:r>
+              <w:rPr>
+                <w:rFonts w:eastAsia="Calibri" w:cs="Arial"/>
+                <w:kern w:val="2"/>
+                <w:sz w:val="22"/>
+                <w:szCs w:val="22"/>
+                <w:lang w:eastAsia="en-US" w:bidi="ar-SA"/>
+              </w:rPr>
+              <w:t>0</w:t>
+            </w:r>
+          </w:p>
+        </w:tc>
+        <w:tc>
+          <w:tcPr>
+            <w:tcW w:w="1136" w:type="dxa"/>
+            <w:tcBorders/>
+            <w:vAlign w:val="center"/>
+          </w:tcPr>
+          <w:p>
+            <w:pPr>
+              <w:pStyle w:val="PunktyTabela"/>
+              <w:widowControl/>
+              <w:suppressAutoHyphens w:val="true"/>
               <w:spacing w:before="0" w:after="0"/>
               <w:jc w:val="center"/>
               <w:rPr>
@@ -3462,8 +3457,8 @@
         <w:tblLook w:val="04a0" w:firstRow="1" w:noVBand="1" w:lastRow="0" w:firstColumn="1" w:lastColumn="0" w:noHBand="0"/>
       </w:tblPr>
       <w:tblGrid>
-        <w:gridCol w:w="8195"/>
-        <w:gridCol w:w="1135"/>
+        <w:gridCol w:w="8194"/>
+        <w:gridCol w:w="1136"/>
         <w:gridCol w:w="1136"/>
       </w:tblGrid>
       <w:tr>
@@ -3472,7 +3467,7 @@
         </w:trPr>
         <w:tc>
           <w:tcPr>
-            <w:tcW w:w="8195" w:type="dxa"/>
+            <w:tcW w:w="8194" w:type="dxa"/>
             <w:tcBorders/>
             <w:vAlign w:val="center"/>
           </w:tcPr>
@@ -3480,6 +3475,7 @@
             <w:pPr>
               <w:pStyle w:val="PunktyTabela"/>
               <w:widowControl/>
+              <w:suppressAutoHyphens w:val="true"/>
               <w:spacing w:before="0" w:after="0"/>
               <w:jc w:val="start"/>
               <w:rPr>
@@ -3499,38 +3495,6 @@
                 <w:lang w:eastAsia="en-US" w:bidi="ar-SA"/>
               </w:rPr>
               <w:t>Punkty:</w:t>
-            </w:r>
-          </w:p>
-        </w:tc>
-        <w:tc>
-          <w:tcPr>
-            <w:tcW w:w="1135" w:type="dxa"/>
-            <w:tcBorders/>
-            <w:vAlign w:val="center"/>
-          </w:tcPr>
-          <w:p>
-            <w:pPr>
-              <w:pStyle w:val="PunktyTabela"/>
-              <w:widowControl/>
-              <w:spacing w:before="0" w:after="0"/>
-              <w:jc w:val="center"/>
-              <w:rPr>
-                <w:rFonts w:ascii="Calibri" w:hAnsi="Calibri" w:eastAsia="Calibri" w:cs="Arial"/>
-                <w:kern w:val="2"/>
-                <w:sz w:val="22"/>
-                <w:szCs w:val="22"/>
-                <w:lang w:eastAsia="en-US" w:bidi="ar-SA"/>
-              </w:rPr>
-            </w:pPr>
-            <w:r>
-              <w:rPr>
-                <w:rFonts w:eastAsia="Calibri" w:cs="Arial"/>
-                <w:kern w:val="2"/>
-                <w:sz w:val="22"/>
-                <w:szCs w:val="22"/>
-                <w:lang w:eastAsia="en-US" w:bidi="ar-SA"/>
-              </w:rPr>
-              <w:t>0</w:t>
             </w:r>
           </w:p>
         </w:tc>
@@ -3544,6 +3508,40 @@
             <w:pPr>
               <w:pStyle w:val="PunktyTabela"/>
               <w:widowControl/>
+              <w:suppressAutoHyphens w:val="true"/>
+              <w:spacing w:before="0" w:after="0"/>
+              <w:jc w:val="center"/>
+              <w:rPr>
+                <w:rFonts w:ascii="Calibri" w:hAnsi="Calibri" w:eastAsia="Calibri" w:cs="Arial"/>
+                <w:kern w:val="2"/>
+                <w:sz w:val="22"/>
+                <w:szCs w:val="22"/>
+                <w:lang w:eastAsia="en-US" w:bidi="ar-SA"/>
+              </w:rPr>
+            </w:pPr>
+            <w:r>
+              <w:rPr>
+                <w:rFonts w:eastAsia="Calibri" w:cs="Arial"/>
+                <w:kern w:val="2"/>
+                <w:sz w:val="22"/>
+                <w:szCs w:val="22"/>
+                <w:lang w:eastAsia="en-US" w:bidi="ar-SA"/>
+              </w:rPr>
+              <w:t>0</w:t>
+            </w:r>
+          </w:p>
+        </w:tc>
+        <w:tc>
+          <w:tcPr>
+            <w:tcW w:w="1136" w:type="dxa"/>
+            <w:tcBorders/>
+            <w:vAlign w:val="center"/>
+          </w:tcPr>
+          <w:p>
+            <w:pPr>
+              <w:pStyle w:val="PunktyTabela"/>
+              <w:widowControl/>
+              <w:suppressAutoHyphens w:val="true"/>
               <w:spacing w:before="0" w:after="0"/>
               <w:jc w:val="center"/>
               <w:rPr>
@@ -4306,8 +4304,8 @@
         <w:tblLook w:val="04a0" w:firstRow="1" w:noVBand="1" w:lastRow="0" w:firstColumn="1" w:lastColumn="0" w:noHBand="0"/>
       </w:tblPr>
       <w:tblGrid>
-        <w:gridCol w:w="8195"/>
-        <w:gridCol w:w="1135"/>
+        <w:gridCol w:w="8194"/>
+        <w:gridCol w:w="1136"/>
         <w:gridCol w:w="1136"/>
       </w:tblGrid>
       <w:tr>
@@ -4316,7 +4314,7 @@
         </w:trPr>
         <w:tc>
           <w:tcPr>
-            <w:tcW w:w="8195" w:type="dxa"/>
+            <w:tcW w:w="8194" w:type="dxa"/>
             <w:tcBorders/>
             <w:vAlign w:val="center"/>
           </w:tcPr>
@@ -4324,6 +4322,7 @@
             <w:pPr>
               <w:pStyle w:val="PunktyTabela"/>
               <w:widowControl/>
+              <w:suppressAutoHyphens w:val="true"/>
               <w:spacing w:before="0" w:after="0"/>
               <w:jc w:val="start"/>
               <w:rPr>
@@ -4343,38 +4342,6 @@
                 <w:lang w:eastAsia="en-US" w:bidi="ar-SA"/>
               </w:rPr>
               <w:t>Punkty:</w:t>
-            </w:r>
-          </w:p>
-        </w:tc>
-        <w:tc>
-          <w:tcPr>
-            <w:tcW w:w="1135" w:type="dxa"/>
-            <w:tcBorders/>
-            <w:vAlign w:val="center"/>
-          </w:tcPr>
-          <w:p>
-            <w:pPr>
-              <w:pStyle w:val="PunktyTabela"/>
-              <w:widowControl/>
-              <w:spacing w:before="0" w:after="0"/>
-              <w:jc w:val="center"/>
-              <w:rPr>
-                <w:rFonts w:ascii="Calibri" w:hAnsi="Calibri" w:eastAsia="Calibri" w:cs="Arial"/>
-                <w:kern w:val="2"/>
-                <w:sz w:val="22"/>
-                <w:szCs w:val="22"/>
-                <w:lang w:eastAsia="en-US" w:bidi="ar-SA"/>
-              </w:rPr>
-            </w:pPr>
-            <w:r>
-              <w:rPr>
-                <w:rFonts w:eastAsia="Calibri" w:cs="Arial"/>
-                <w:kern w:val="2"/>
-                <w:sz w:val="22"/>
-                <w:szCs w:val="22"/>
-                <w:lang w:eastAsia="en-US" w:bidi="ar-SA"/>
-              </w:rPr>
-              <w:t>0</w:t>
             </w:r>
           </w:p>
         </w:tc>
@@ -4388,6 +4355,40 @@
             <w:pPr>
               <w:pStyle w:val="PunktyTabela"/>
               <w:widowControl/>
+              <w:suppressAutoHyphens w:val="true"/>
+              <w:spacing w:before="0" w:after="0"/>
+              <w:jc w:val="center"/>
+              <w:rPr>
+                <w:rFonts w:ascii="Calibri" w:hAnsi="Calibri" w:eastAsia="Calibri" w:cs="Arial"/>
+                <w:kern w:val="2"/>
+                <w:sz w:val="22"/>
+                <w:szCs w:val="22"/>
+                <w:lang w:eastAsia="en-US" w:bidi="ar-SA"/>
+              </w:rPr>
+            </w:pPr>
+            <w:r>
+              <w:rPr>
+                <w:rFonts w:eastAsia="Calibri" w:cs="Arial"/>
+                <w:kern w:val="2"/>
+                <w:sz w:val="22"/>
+                <w:szCs w:val="22"/>
+                <w:lang w:eastAsia="en-US" w:bidi="ar-SA"/>
+              </w:rPr>
+              <w:t>0</w:t>
+            </w:r>
+          </w:p>
+        </w:tc>
+        <w:tc>
+          <w:tcPr>
+            <w:tcW w:w="1136" w:type="dxa"/>
+            <w:tcBorders/>
+            <w:vAlign w:val="center"/>
+          </w:tcPr>
+          <w:p>
+            <w:pPr>
+              <w:pStyle w:val="PunktyTabela"/>
+              <w:widowControl/>
+              <w:suppressAutoHyphens w:val="true"/>
               <w:spacing w:before="0" w:after="0"/>
               <w:jc w:val="center"/>
               <w:rPr>
@@ -5058,8 +5059,8 @@
         <w:tblLook w:val="04a0" w:firstRow="1" w:noVBand="1" w:lastRow="0" w:firstColumn="1" w:lastColumn="0" w:noHBand="0"/>
       </w:tblPr>
       <w:tblGrid>
-        <w:gridCol w:w="8195"/>
-        <w:gridCol w:w="1135"/>
+        <w:gridCol w:w="8194"/>
+        <w:gridCol w:w="1136"/>
         <w:gridCol w:w="1136"/>
       </w:tblGrid>
       <w:tr>
@@ -5068,7 +5069,7 @@
         </w:trPr>
         <w:tc>
           <w:tcPr>
-            <w:tcW w:w="8195" w:type="dxa"/>
+            <w:tcW w:w="8194" w:type="dxa"/>
             <w:tcBorders/>
             <w:vAlign w:val="center"/>
           </w:tcPr>
@@ -5076,6 +5077,7 @@
             <w:pPr>
               <w:pStyle w:val="PunktyTabela"/>
               <w:widowControl/>
+              <w:suppressAutoHyphens w:val="true"/>
               <w:spacing w:before="0" w:after="0"/>
               <w:jc w:val="start"/>
               <w:rPr>
@@ -5095,38 +5097,6 @@
                 <w:lang w:eastAsia="en-US" w:bidi="ar-SA"/>
               </w:rPr>
               <w:t>Punkty:</w:t>
-            </w:r>
-          </w:p>
-        </w:tc>
-        <w:tc>
-          <w:tcPr>
-            <w:tcW w:w="1135" w:type="dxa"/>
-            <w:tcBorders/>
-            <w:vAlign w:val="center"/>
-          </w:tcPr>
-          <w:p>
-            <w:pPr>
-              <w:pStyle w:val="PunktyTabela"/>
-              <w:widowControl/>
-              <w:spacing w:before="0" w:after="0"/>
-              <w:jc w:val="center"/>
-              <w:rPr>
-                <w:rFonts w:ascii="Calibri" w:hAnsi="Calibri" w:eastAsia="Calibri" w:cs="Arial"/>
-                <w:kern w:val="2"/>
-                <w:sz w:val="22"/>
-                <w:szCs w:val="22"/>
-                <w:lang w:eastAsia="en-US" w:bidi="ar-SA"/>
-              </w:rPr>
-            </w:pPr>
-            <w:r>
-              <w:rPr>
-                <w:rFonts w:eastAsia="Calibri" w:cs="Arial"/>
-                <w:kern w:val="2"/>
-                <w:sz w:val="22"/>
-                <w:szCs w:val="22"/>
-                <w:lang w:eastAsia="en-US" w:bidi="ar-SA"/>
-              </w:rPr>
-              <w:t>0</w:t>
             </w:r>
           </w:p>
         </w:tc>
@@ -5140,6 +5110,40 @@
             <w:pPr>
               <w:pStyle w:val="PunktyTabela"/>
               <w:widowControl/>
+              <w:suppressAutoHyphens w:val="true"/>
+              <w:spacing w:before="0" w:after="0"/>
+              <w:jc w:val="center"/>
+              <w:rPr>
+                <w:rFonts w:ascii="Calibri" w:hAnsi="Calibri" w:eastAsia="Calibri" w:cs="Arial"/>
+                <w:kern w:val="2"/>
+                <w:sz w:val="22"/>
+                <w:szCs w:val="22"/>
+                <w:lang w:eastAsia="en-US" w:bidi="ar-SA"/>
+              </w:rPr>
+            </w:pPr>
+            <w:r>
+              <w:rPr>
+                <w:rFonts w:eastAsia="Calibri" w:cs="Arial"/>
+                <w:kern w:val="2"/>
+                <w:sz w:val="22"/>
+                <w:szCs w:val="22"/>
+                <w:lang w:eastAsia="en-US" w:bidi="ar-SA"/>
+              </w:rPr>
+              <w:t>0</w:t>
+            </w:r>
+          </w:p>
+        </w:tc>
+        <w:tc>
+          <w:tcPr>
+            <w:tcW w:w="1136" w:type="dxa"/>
+            <w:tcBorders/>
+            <w:vAlign w:val="center"/>
+          </w:tcPr>
+          <w:p>
+            <w:pPr>
+              <w:pStyle w:val="PunktyTabela"/>
+              <w:widowControl/>
+              <w:suppressAutoHyphens w:val="true"/>
               <w:spacing w:before="0" w:after="0"/>
               <w:jc w:val="center"/>
               <w:rPr>
@@ -5675,8 +5679,8 @@
         <w:tblLook w:val="04a0" w:firstRow="1" w:noVBand="1" w:lastRow="0" w:firstColumn="1" w:lastColumn="0" w:noHBand="0"/>
       </w:tblPr>
       <w:tblGrid>
-        <w:gridCol w:w="8195"/>
-        <w:gridCol w:w="1135"/>
+        <w:gridCol w:w="8194"/>
+        <w:gridCol w:w="1136"/>
         <w:gridCol w:w="1136"/>
       </w:tblGrid>
       <w:tr>
@@ -5685,7 +5689,7 @@
         </w:trPr>
         <w:tc>
           <w:tcPr>
-            <w:tcW w:w="8195" w:type="dxa"/>
+            <w:tcW w:w="8194" w:type="dxa"/>
             <w:tcBorders/>
             <w:vAlign w:val="center"/>
           </w:tcPr>
@@ -5693,6 +5697,7 @@
             <w:pPr>
               <w:pStyle w:val="PunktyTabela"/>
               <w:widowControl/>
+              <w:suppressAutoHyphens w:val="true"/>
               <w:spacing w:before="0" w:after="0"/>
               <w:jc w:val="start"/>
               <w:rPr>
@@ -5712,38 +5717,6 @@
                 <w:lang w:eastAsia="en-US" w:bidi="ar-SA"/>
               </w:rPr>
               <w:t>Punkty:</w:t>
-            </w:r>
-          </w:p>
-        </w:tc>
-        <w:tc>
-          <w:tcPr>
-            <w:tcW w:w="1135" w:type="dxa"/>
-            <w:tcBorders/>
-            <w:vAlign w:val="center"/>
-          </w:tcPr>
-          <w:p>
-            <w:pPr>
-              <w:pStyle w:val="PunktyTabela"/>
-              <w:widowControl/>
-              <w:spacing w:before="0" w:after="0"/>
-              <w:jc w:val="center"/>
-              <w:rPr>
-                <w:rFonts w:ascii="Calibri" w:hAnsi="Calibri" w:eastAsia="Calibri" w:cs="Arial"/>
-                <w:kern w:val="2"/>
-                <w:sz w:val="22"/>
-                <w:szCs w:val="22"/>
-                <w:lang w:eastAsia="en-US" w:bidi="ar-SA"/>
-              </w:rPr>
-            </w:pPr>
-            <w:r>
-              <w:rPr>
-                <w:rFonts w:eastAsia="Calibri" w:cs="Arial"/>
-                <w:kern w:val="2"/>
-                <w:sz w:val="22"/>
-                <w:szCs w:val="22"/>
-                <w:lang w:eastAsia="en-US" w:bidi="ar-SA"/>
-              </w:rPr>
-              <w:t>0</w:t>
             </w:r>
           </w:p>
         </w:tc>
@@ -5757,6 +5730,40 @@
             <w:pPr>
               <w:pStyle w:val="PunktyTabela"/>
               <w:widowControl/>
+              <w:suppressAutoHyphens w:val="true"/>
+              <w:spacing w:before="0" w:after="0"/>
+              <w:jc w:val="center"/>
+              <w:rPr>
+                <w:rFonts w:ascii="Calibri" w:hAnsi="Calibri" w:eastAsia="Calibri" w:cs="Arial"/>
+                <w:kern w:val="2"/>
+                <w:sz w:val="22"/>
+                <w:szCs w:val="22"/>
+                <w:lang w:eastAsia="en-US" w:bidi="ar-SA"/>
+              </w:rPr>
+            </w:pPr>
+            <w:r>
+              <w:rPr>
+                <w:rFonts w:eastAsia="Calibri" w:cs="Arial"/>
+                <w:kern w:val="2"/>
+                <w:sz w:val="22"/>
+                <w:szCs w:val="22"/>
+                <w:lang w:eastAsia="en-US" w:bidi="ar-SA"/>
+              </w:rPr>
+              <w:t>0</w:t>
+            </w:r>
+          </w:p>
+        </w:tc>
+        <w:tc>
+          <w:tcPr>
+            <w:tcW w:w="1136" w:type="dxa"/>
+            <w:tcBorders/>
+            <w:vAlign w:val="center"/>
+          </w:tcPr>
+          <w:p>
+            <w:pPr>
+              <w:pStyle w:val="PunktyTabela"/>
+              <w:widowControl/>
+              <w:suppressAutoHyphens w:val="true"/>
               <w:spacing w:before="0" w:after="0"/>
               <w:jc w:val="center"/>
               <w:rPr>
@@ -6916,8 +6923,8 @@
         <w:tblLook w:val="04a0" w:firstRow="1" w:noVBand="1" w:lastRow="0" w:firstColumn="1" w:lastColumn="0" w:noHBand="0"/>
       </w:tblPr>
       <w:tblGrid>
-        <w:gridCol w:w="8195"/>
-        <w:gridCol w:w="1135"/>
+        <w:gridCol w:w="8194"/>
+        <w:gridCol w:w="1136"/>
         <w:gridCol w:w="1136"/>
       </w:tblGrid>
       <w:tr>
@@ -6926,7 +6933,7 @@
         </w:trPr>
         <w:tc>
           <w:tcPr>
-            <w:tcW w:w="8195" w:type="dxa"/>
+            <w:tcW w:w="8194" w:type="dxa"/>
             <w:tcBorders/>
             <w:vAlign w:val="center"/>
           </w:tcPr>
@@ -6934,6 +6941,7 @@
             <w:pPr>
               <w:pStyle w:val="PunktyTabela"/>
               <w:widowControl/>
+              <w:suppressAutoHyphens w:val="true"/>
               <w:spacing w:before="0" w:after="0"/>
               <w:jc w:val="start"/>
               <w:rPr>
@@ -6953,38 +6961,6 @@
                 <w:lang w:eastAsia="en-US" w:bidi="ar-SA"/>
               </w:rPr>
               <w:t>Punkty:</w:t>
-            </w:r>
-          </w:p>
-        </w:tc>
-        <w:tc>
-          <w:tcPr>
-            <w:tcW w:w="1135" w:type="dxa"/>
-            <w:tcBorders/>
-            <w:vAlign w:val="center"/>
-          </w:tcPr>
-          <w:p>
-            <w:pPr>
-              <w:pStyle w:val="PunktyTabela"/>
-              <w:widowControl/>
-              <w:spacing w:before="0" w:after="0"/>
-              <w:jc w:val="center"/>
-              <w:rPr>
-                <w:rFonts w:ascii="Calibri" w:hAnsi="Calibri" w:eastAsia="Calibri" w:cs="Arial"/>
-                <w:kern w:val="2"/>
-                <w:sz w:val="22"/>
-                <w:szCs w:val="22"/>
-                <w:lang w:eastAsia="en-US" w:bidi="ar-SA"/>
-              </w:rPr>
-            </w:pPr>
-            <w:r>
-              <w:rPr>
-                <w:rFonts w:eastAsia="Calibri" w:cs="Arial"/>
-                <w:kern w:val="2"/>
-                <w:sz w:val="22"/>
-                <w:szCs w:val="22"/>
-                <w:lang w:eastAsia="en-US" w:bidi="ar-SA"/>
-              </w:rPr>
-              <w:t>0</w:t>
             </w:r>
           </w:p>
         </w:tc>
@@ -6998,6 +6974,40 @@
             <w:pPr>
               <w:pStyle w:val="PunktyTabela"/>
               <w:widowControl/>
+              <w:suppressAutoHyphens w:val="true"/>
+              <w:spacing w:before="0" w:after="0"/>
+              <w:jc w:val="center"/>
+              <w:rPr>
+                <w:rFonts w:ascii="Calibri" w:hAnsi="Calibri" w:eastAsia="Calibri" w:cs="Arial"/>
+                <w:kern w:val="2"/>
+                <w:sz w:val="22"/>
+                <w:szCs w:val="22"/>
+                <w:lang w:eastAsia="en-US" w:bidi="ar-SA"/>
+              </w:rPr>
+            </w:pPr>
+            <w:r>
+              <w:rPr>
+                <w:rFonts w:eastAsia="Calibri" w:cs="Arial"/>
+                <w:kern w:val="2"/>
+                <w:sz w:val="22"/>
+                <w:szCs w:val="22"/>
+                <w:lang w:eastAsia="en-US" w:bidi="ar-SA"/>
+              </w:rPr>
+              <w:t>0</w:t>
+            </w:r>
+          </w:p>
+        </w:tc>
+        <w:tc>
+          <w:tcPr>
+            <w:tcW w:w="1136" w:type="dxa"/>
+            <w:tcBorders/>
+            <w:vAlign w:val="center"/>
+          </w:tcPr>
+          <w:p>
+            <w:pPr>
+              <w:pStyle w:val="PunktyTabela"/>
+              <w:widowControl/>
+              <w:suppressAutoHyphens w:val="true"/>
               <w:spacing w:before="0" w:after="0"/>
               <w:jc w:val="center"/>
               <w:rPr>
@@ -8454,7 +8464,7 @@
   <w:docDefaults>
     <w:rPrDefault>
       <w:rPr>
-        <w:rFonts w:ascii="Calibri" w:hAnsi="Calibri" w:eastAsia="Calibri" w:cs="Arial" w:asciiTheme="minorHAnsi" w:cstheme="minorBidi" w:eastAsiaTheme="minorHAnsi" w:hAnsiTheme="minorHAnsi"/>
+        <w:rFonts w:ascii="Calibri" w:hAnsi="Calibri" w:eastAsia="Calibri" w:cs="" w:asciiTheme="minorHAnsi" w:cstheme="minorBidi" w:eastAsiaTheme="minorHAnsi" w:hAnsiTheme="minorHAnsi"/>
         <w:kern w:val="2"/>
         <w:sz w:val="22"/>
         <w:szCs w:val="22"/>
@@ -8851,12 +8861,13 @@
     <w:qFormat/>
     <w:pPr>
       <w:widowControl/>
+      <w:suppressAutoHyphens w:val="true"/>
       <w:bidi w:val="0"/>
       <w:spacing w:lineRule="auto" w:line="259" w:before="0" w:after="160"/>
       <w:jc w:val="start"/>
     </w:pPr>
     <w:rPr>
-      <w:rFonts w:ascii="Calibri" w:hAnsi="Calibri" w:eastAsia="Calibri" w:cs="Arial" w:asciiTheme="minorHAnsi" w:cstheme="minorBidi" w:eastAsiaTheme="minorHAnsi" w:hAnsiTheme="minorHAnsi"/>
+      <w:rFonts w:ascii="Calibri" w:hAnsi="Calibri" w:eastAsia="Calibri" w:cs="" w:asciiTheme="minorHAnsi" w:cstheme="minorBidi" w:eastAsiaTheme="minorHAnsi" w:hAnsiTheme="minorHAnsi"/>
       <w:color w:val="auto"/>
       <w:kern w:val="2"/>
       <w:sz w:val="22"/>
@@ -8880,7 +8891,7 @@
       <w:outlineLvl w:val="0"/>
     </w:pPr>
     <w:rPr>
-      <w:rFonts w:ascii="Calibri Light" w:hAnsi="Calibri Light" w:eastAsia="" w:cs="Times New Roman" w:asciiTheme="majorHAnsi" w:cstheme="majorBidi" w:eastAsiaTheme="majorEastAsia" w:hAnsiTheme="majorHAnsi"/>
+      <w:rFonts w:ascii="Calibri Light" w:hAnsi="Calibri Light" w:eastAsia="" w:cs="" w:asciiTheme="majorHAnsi" w:cstheme="majorBidi" w:eastAsiaTheme="majorEastAsia" w:hAnsiTheme="majorHAnsi"/>
       <w:b/>
       <w:smallCaps/>
       <w:sz w:val="32"/>
@@ -8918,7 +8929,7 @@
     <w:qFormat/>
     <w:rsid w:val="003b2421"/>
     <w:rPr>
-      <w:rFonts w:ascii="Calibri Light" w:hAnsi="Calibri Light" w:eastAsia="" w:cs="Times New Roman" w:asciiTheme="majorHAnsi" w:cstheme="majorBidi" w:eastAsiaTheme="majorEastAsia" w:hAnsiTheme="majorHAnsi"/>
+      <w:rFonts w:ascii="Calibri Light" w:hAnsi="Calibri Light" w:eastAsia="" w:cs="" w:asciiTheme="majorHAnsi" w:cstheme="majorBidi" w:eastAsiaTheme="majorEastAsia" w:hAnsiTheme="majorHAnsi"/>
       <w:b/>
       <w:smallCaps/>
       <w:sz w:val="32"/>
@@ -8943,7 +8954,7 @@
     <w:qFormat/>
     <w:rsid w:val="003b2421"/>
     <w:rPr>
-      <w:rFonts w:ascii="Calibri Light" w:hAnsi="Calibri Light" w:eastAsia="" w:cs="Times New Roman" w:asciiTheme="majorHAnsi" w:cstheme="majorBidi" w:eastAsiaTheme="majorEastAsia" w:hAnsiTheme="majorHAnsi"/>
+      <w:rFonts w:ascii="Calibri Light" w:hAnsi="Calibri Light" w:eastAsia="" w:cs="" w:asciiTheme="majorHAnsi" w:cstheme="majorBidi" w:eastAsiaTheme="majorEastAsia" w:hAnsiTheme="majorHAnsi"/>
       <w:b/>
       <w:smallCaps/>
       <w:spacing w:val="-10"/>
@@ -8988,6 +8999,11 @@
       <w:shd w:fill="F2F2F2" w:val="clear"/>
       <w:lang w:val="pl-PL"/>
     </w:rPr>
+  </w:style>
+  <w:style w:type="character" w:styleId="czeindeksuuser">
+    <w:name w:val="Łącze indeksu (user)"/>
+    <w:qFormat/>
+    <w:rPr/>
   </w:style>
   <w:style w:type="character" w:styleId="czeindeksu">
     <w:name w:val="Łącze indeksu"/>
@@ -9051,6 +9067,39 @@
     <w:rPr>
       <w:rFonts w:cs="Arial"/>
     </w:rPr>
+  </w:style>
+  <w:style w:type="paragraph" w:styleId="Nagwekuser">
+    <w:name w:val="Nagłówek (user)"/>
+    <w:basedOn w:val="Normal"/>
+    <w:next w:val="BodyText"/>
+    <w:qFormat/>
+    <w:pPr>
+      <w:keepNext w:val="true"/>
+      <w:spacing w:before="240" w:after="120"/>
+    </w:pPr>
+    <w:rPr>
+      <w:rFonts w:ascii="Liberation Sans" w:hAnsi="Liberation Sans" w:eastAsia="Microsoft YaHei" w:cs="Arial"/>
+      <w:sz w:val="28"/>
+      <w:szCs w:val="28"/>
+    </w:rPr>
+  </w:style>
+  <w:style w:type="paragraph" w:styleId="Indeksuser">
+    <w:name w:val="Indeks (user)"/>
+    <w:basedOn w:val="Normal"/>
+    <w:qFormat/>
+    <w:pPr>
+      <w:suppressLineNumbers/>
+    </w:pPr>
+    <w:rPr>
+      <w:rFonts w:cs="Arial"/>
+    </w:rPr>
+  </w:style>
+  <w:style w:type="paragraph" w:styleId="Gwkaistopkauser">
+    <w:name w:val="Główka i stopka (user)"/>
+    <w:basedOn w:val="Normal"/>
+    <w:qFormat/>
+    <w:pPr/>
+    <w:rPr/>
   </w:style>
   <w:style w:type="paragraph" w:styleId="Gwkaistopka">
     <w:name w:val="Główka i stopka"/>
@@ -9124,7 +9173,7 @@
       <w:jc w:val="center"/>
     </w:pPr>
     <w:rPr>
-      <w:rFonts w:ascii="Calibri Light" w:hAnsi="Calibri Light" w:eastAsia="" w:cs="Times New Roman" w:asciiTheme="majorHAnsi" w:cstheme="majorBidi" w:eastAsiaTheme="majorEastAsia" w:hAnsiTheme="majorHAnsi"/>
+      <w:rFonts w:ascii="Calibri Light" w:hAnsi="Calibri Light" w:eastAsia="" w:cs="" w:asciiTheme="majorHAnsi" w:cstheme="majorBidi" w:eastAsiaTheme="majorEastAsia" w:hAnsiTheme="majorHAnsi"/>
       <w:b/>
       <w:smallCaps/>
       <w:spacing w:val="-10"/>
@@ -9218,8 +9267,8 @@
       <w:lang w:val="pl-PL"/>
     </w:rPr>
   </w:style>
-  <w:style w:type="numbering" w:styleId="Bezlisty" w:default="1">
-    <w:name w:val="Bez listy"/>
+  <w:style w:type="numbering" w:styleId="Bezlistyuser" w:default="1">
+    <w:name w:val="Bez listy (user)"/>
     <w:uiPriority w:val="99"/>
     <w:semiHidden/>
     <w:unhideWhenUsed/>

</xml_diff>

<commit_message>
chore: initialize lab A Composer project and update report
</commit_message>
<xml_diff>
--- a/AI2-LA-gr432-woźniak-jakub.docx
+++ b/AI2-LA-gr432-woźniak-jakub.docx
@@ -2610,7 +2610,7 @@
       <w:r>
         <w:rPr/>
         <w:drawing>
-          <wp:anchor distT="0" distB="0" distL="0" distR="0" simplePos="0" relativeHeight="13" behindDoc="0" locked="0" layoutInCell="0" allowOverlap="1">
+          <wp:anchor distT="0" distB="0" distL="0" distR="0" simplePos="0" relativeHeight="11" behindDoc="0" locked="0" layoutInCell="0" allowOverlap="1">
             <wp:simplePos x="0" y="0"/>
             <wp:positionH relativeFrom="column">
               <wp:align>center</wp:align>
@@ -3282,10 +3282,18 @@
       <w:r>
         <w:rPr/>
         <w:drawing>
-          <wp:inline distT="0" distB="0" distL="0" distR="0">
-            <wp:extent cx="899795" cy="899795"/>
+          <wp:anchor distT="0" distB="0" distL="0" distR="0" simplePos="0" relativeHeight="12" behindDoc="0" locked="0" layoutInCell="0" allowOverlap="1">
+            <wp:simplePos x="0" y="0"/>
+            <wp:positionH relativeFrom="column">
+              <wp:align>center</wp:align>
+            </wp:positionH>
+            <wp:positionV relativeFrom="paragraph">
+              <wp:posOffset>635</wp:posOffset>
+            </wp:positionV>
+            <wp:extent cx="6645910" cy="4921885"/>
             <wp:effectExtent l="0" t="0" r="0" b="0"/>
-            <wp:docPr id="5" name="Obraz 109803217"/>
+            <wp:wrapSquare wrapText="largest"/>
+            <wp:docPr id="5" name="Obraz7"/>
             <wp:cNvGraphicFramePr>
               <a:graphicFrameLocks xmlns:a="http://schemas.openxmlformats.org/drawingml/2006/main" noChangeAspect="1"/>
             </wp:cNvGraphicFramePr>
@@ -3293,7 +3301,7 @@
               <a:graphicData uri="http://schemas.openxmlformats.org/drawingml/2006/picture">
                 <pic:pic xmlns:pic="http://schemas.openxmlformats.org/drawingml/2006/picture">
                   <pic:nvPicPr>
-                    <pic:cNvPr id="5" name="Obraz 109803217"/>
+                    <pic:cNvPr id="5" name="Obraz7"/>
                     <pic:cNvPicPr>
                       <a:picLocks noChangeAspect="1" noChangeArrowheads="1"/>
                     </pic:cNvPicPr>
@@ -3307,7 +3315,7 @@
                   <pic:spPr bwMode="auto">
                     <a:xfrm>
                       <a:off x="0" y="0"/>
-                      <a:ext cx="899795" cy="899795"/>
+                      <a:ext cx="6645910" cy="4921885"/>
                     </a:xfrm>
                     <a:prstGeom prst="rect">
                       <a:avLst/>
@@ -3317,7 +3325,7 @@
                 </pic:pic>
               </a:graphicData>
             </a:graphic>
-          </wp:inline>
+          </wp:anchor>
         </w:drawing>
       </w:r>
     </w:p>
@@ -3388,10 +3396,18 @@
       <w:r>
         <w:rPr/>
         <w:drawing>
-          <wp:inline distT="0" distB="0" distL="0" distR="0">
-            <wp:extent cx="899795" cy="899795"/>
+          <wp:anchor distT="0" distB="0" distL="0" distR="0" simplePos="0" relativeHeight="13" behindDoc="0" locked="0" layoutInCell="0" allowOverlap="1">
+            <wp:simplePos x="0" y="0"/>
+            <wp:positionH relativeFrom="column">
+              <wp:align>center</wp:align>
+            </wp:positionH>
+            <wp:positionV relativeFrom="paragraph">
+              <wp:posOffset>635</wp:posOffset>
+            </wp:positionV>
+            <wp:extent cx="6645910" cy="3053715"/>
             <wp:effectExtent l="0" t="0" r="0" b="0"/>
-            <wp:docPr id="6" name="Obraz 848706621"/>
+            <wp:wrapSquare wrapText="largest"/>
+            <wp:docPr id="6" name="Obraz8"/>
             <wp:cNvGraphicFramePr>
               <a:graphicFrameLocks xmlns:a="http://schemas.openxmlformats.org/drawingml/2006/main" noChangeAspect="1"/>
             </wp:cNvGraphicFramePr>
@@ -3399,7 +3415,7 @@
               <a:graphicData uri="http://schemas.openxmlformats.org/drawingml/2006/picture">
                 <pic:pic xmlns:pic="http://schemas.openxmlformats.org/drawingml/2006/picture">
                   <pic:nvPicPr>
-                    <pic:cNvPr id="6" name="Obraz 848706621"/>
+                    <pic:cNvPr id="6" name="Obraz8"/>
                     <pic:cNvPicPr>
                       <a:picLocks noChangeAspect="1" noChangeArrowheads="1"/>
                     </pic:cNvPicPr>
@@ -3413,7 +3429,7 @@
                   <pic:spPr bwMode="auto">
                     <a:xfrm>
                       <a:off x="0" y="0"/>
-                      <a:ext cx="899795" cy="899795"/>
+                      <a:ext cx="6645910" cy="3053715"/>
                     </a:xfrm>
                     <a:prstGeom prst="rect">
                       <a:avLst/>
@@ -3423,7 +3439,7 @@
                 </pic:pic>
               </a:graphicData>
             </a:graphic>
-          </wp:inline>
+          </wp:anchor>
         </w:drawing>
       </w:r>
     </w:p>
@@ -7198,7 +7214,7 @@
             <w:sz w:val="24"/>
             <w:szCs w:val="24"/>
           </w:rPr>
-          <w:t>10</w:t>
+          <w:t>11</w:t>
         </w:r>
         <w:r>
           <w:rPr>
@@ -7249,7 +7265,7 @@
             <w:sz w:val="24"/>
             <w:szCs w:val="24"/>
           </w:rPr>
-          <w:t>10</w:t>
+          <w:t>11</w:t>
         </w:r>
         <w:r>
           <w:rPr>
@@ -7385,7 +7401,7 @@
             <w:sz w:val="24"/>
             <w:szCs w:val="24"/>
           </w:rPr>
-          <w:t>10</w:t>
+          <w:t>11</w:t>
         </w:r>
         <w:r>
           <w:rPr>

</xml_diff>